<commit_message>
Update portfolio URL metadata and resume
</commit_message>
<xml_diff>
--- a/uploads/Sree Charan Damodara.docx
+++ b/uploads/Sree Charan Damodara.docx
@@ -44,9 +44,15 @@
           <w:color w:val="3A3833"/>
           <w:sz w:val="16"/>
         </w:rPr>
-        <w:t>Dallas, TX</w:t>
+        <w:t xml:space="preserve">Dallas, TX</w:t>
       </w:r>
       <w:r>
+        <w:rPr>
+          <w:rFonts w:ascii="Aptos" w:hAnsi="Aptos" w:eastAsia="Aptos"/>
+          <w:b w:val="0"/>
+          <w:color w:val="3A3833"/>
+          <w:sz w:val="16"/>
+        </w:rPr>
         <w:t xml:space="preserve">  |  </w:t>
       </w:r>
       <w:r>
@@ -56,9 +62,15 @@
           <w:color w:val="3A3833"/>
           <w:sz w:val="16"/>
         </w:rPr>
-        <w:t>(660) 541-2885</w:t>
+        <w:t xml:space="preserve">(660) 541-2885</w:t>
       </w:r>
       <w:r>
+        <w:rPr>
+          <w:rFonts w:ascii="Aptos" w:hAnsi="Aptos" w:eastAsia="Aptos"/>
+          <w:b w:val="0"/>
+          <w:color w:val="3A3833"/>
+          <w:sz w:val="16"/>
+        </w:rPr>
         <w:t xml:space="preserve">  |  </w:t>
       </w:r>
       <w:r>
@@ -68,44 +80,71 @@
           <w:color w:val="3A3833"/>
           <w:sz w:val="16"/>
         </w:rPr>
-        <w:t>sreecharan.damodara@gmail.com</w:t>
+        <w:t xml:space="preserve">sreecharan.damodara@gmail.com</w:t>
       </w:r>
       <w:r>
+        <w:rPr>
+          <w:rFonts w:ascii="Aptos" w:hAnsi="Aptos" w:eastAsia="Aptos"/>
+          <w:b w:val="0"/>
+          <w:color w:val="3A3833"/>
+          <w:sz w:val="16"/>
+        </w:rPr>
         <w:t xml:space="preserve">  |  </w:t>
       </w:r>
       <w:hyperlink r:id="rId9">
         <w:r>
           <w:rPr>
-            <w:color w:val="1F6B6B"/>
+            <w:rFonts w:ascii="Aptos" w:hAnsi="Aptos" w:eastAsia="Aptos"/>
+            <w:b w:val="0"/>
+            <w:color w:val="3A3833"/>
+            <w:sz w:val="16"/>
             <w:u w:val="single"/>
           </w:rPr>
           <w:t>LinkedIn</w:t>
         </w:r>
       </w:hyperlink>
       <w:r>
+        <w:rPr>
+          <w:rFonts w:ascii="Aptos" w:hAnsi="Aptos" w:eastAsia="Aptos"/>
+          <w:b w:val="0"/>
+          <w:color w:val="3A3833"/>
+          <w:sz w:val="16"/>
+        </w:rPr>
         <w:t xml:space="preserve">  |  </w:t>
       </w:r>
       <w:hyperlink r:id="rId10">
         <w:r>
           <w:rPr>
-            <w:color w:val="1F6B6B"/>
+            <w:rFonts w:ascii="Aptos" w:hAnsi="Aptos" w:eastAsia="Aptos"/>
+            <w:b w:val="0"/>
+            <w:color w:val="3A3833"/>
+            <w:sz w:val="16"/>
             <w:u w:val="single"/>
           </w:rPr>
           <w:t>GitHub</w:t>
         </w:r>
       </w:hyperlink>
       <w:r>
+        <w:rPr>
+          <w:rFonts w:ascii="Aptos" w:hAnsi="Aptos" w:eastAsia="Aptos"/>
+          <w:b w:val="0"/>
+          <w:color w:val="3A3833"/>
+          <w:sz w:val="16"/>
+        </w:rPr>
         <w:t xml:space="preserve">  |  </w:t>
       </w:r>
-      <w:r>
-        <w:rPr>
-          <w:rFonts w:ascii="Aptos" w:hAnsi="Aptos" w:eastAsia="Aptos"/>
-          <w:b/>
-          <w:color w:val="1F6B6B"/>
-          <w:sz w:val="16"/>
-        </w:rPr>
-        <w:t>Portfolio: add live URL</w:t>
-      </w:r>
+      <w:hyperlink r:id="rId11">
+        <w:r>
+          <w:rPr>
+            <w:rFonts w:ascii="Aptos" w:hAnsi="Aptos" w:eastAsia="Aptos"/>
+            <w:b w:val="0"/>
+            <w:color w:val="3A3833"/>
+            <w:sz w:val="16"/>
+            <w:u w:val="single"/>
+          </w:rPr>
+          <w:t>Portfolio</w:t>
+        </w:r>
+      </w:hyperlink>
     </w:p>
     <w:p>
       <w:pPr>

</xml_diff>